<commit_message>
Show all caps / small caps runs (DOCX w:caps, w:smallCaps; PPTX cap)
Characters are upper-cased when measured and drawn, keeping the model text and
offsets unchanged. Small caps are drawn as plain capitals for now. Run shading
(w:rPr/w:shd) is deliberately not drawn yet: WPS writes white shading under
white text on colored shapes.

Co-Authored-By: Claude Opus 5.5 <noreply@anthropic.com>
</commit_message>
<xml_diff>
--- a/android_document/src/androidTest/assets/samples/shape_in_table.docx
+++ b/android_document/src/androidTest/assets/samples/shape_in_table.docx
@@ -167,6 +167,25 @@
         <w:t>After the table</w:t>
       </w:r>
     </w:p>
+    <w:p>
+      <w:r>
+        <w:rPr>
+          <w:caps/>
+        </w:rPr>
+        <w:t>all caps: xin chào việt nam</w:t>
+      </w:r>
+      <w:r>
+        <w:t xml:space="preserve"> | normal</w:t>
+      </w:r>
+    </w:p>
+    <w:p>
+      <w:r>
+        <w:rPr>
+          <w:caps w:val="0"/>
+        </w:rPr>
+        <w:t>caps off: unchanged</w:t>
+      </w:r>
+    </w:p>
     <w:sectPr>
       <w:pgSz w:w="11906" w:h="16838"/>
       <w:pgMar w:top="1440" w:right="1800" w:bottom="1440" w:left="1800" w:header="851" w:footer="992"/>

</xml_diff>

<commit_message>
DOCX: move floating shapes with centered/right-aligned tables
Co-Authored-By: Claude Opus 5.5 <noreply@anthropic.com>
</commit_message>
<xml_diff>
--- a/android_document/src/androidTest/assets/samples/shape_in_table.docx
+++ b/android_document/src/androidTest/assets/samples/shape_in_table.docx
@@ -186,6 +186,99 @@
         <w:t>caps off: unchanged</w:t>
       </w:r>
     </w:p>
+    <w:p/>
+    <w:tbl>
+      <w:tblPr>
+        <w:jc w:val="center"/>
+        <w:tblW w:w="4000" w:type="dxa"/>
+        <w:tblBorders>
+          <w:top w:val="single" w:sz="8"/>
+          <w:left w:val="single" w:sz="8"/>
+          <w:bottom w:val="single" w:sz="8"/>
+          <w:right w:val="single" w:sz="8"/>
+        </w:tblBorders>
+      </w:tblPr>
+      <w:tblGrid>
+        <w:gridCol w:w="4000"/>
+      </w:tblGrid>
+      <w:tr>
+        <w:tc>
+          <w:tcPr>
+            <w:tcW w:w="4000" w:type="dxa"/>
+          </w:tcPr>
+          <w:p>
+            <w:r>
+              <w:t>centered table</w:t>
+            </w:r>
+          </w:p>
+          <w:p>
+            <w:r>
+              <w:t>anchor</w:t>
+            </w:r>
+            <w:r>
+              <mc:AlternateContent>
+                <mc:Choice Requires="wps">
+                  <w:drawing>
+                    <wp:anchor distT="0" distB="0" distL="0" distR="0" simplePos="0" relativeHeight="5" behindDoc="0" locked="0" layoutInCell="1" allowOverlap="1">
+                      <wp:simplePos x="0" y="0"/>
+                      <wp:positionH relativeFrom="column">
+                        <wp:posOffset>0</wp:posOffset>
+                      </wp:positionH>
+                      <wp:positionV relativeFrom="paragraph">
+                        <wp:posOffset>0</wp:posOffset>
+                      </wp:positionV>
+                      <wp:extent cx="1270000" cy="381000"/>
+                      <wp:effectExtent l="0" t="0" r="0" b="0"/>
+                      <wp:wrapNone/>
+                      <wp:docPr id="2" name="Box2"/>
+                      <wp:cNvGraphicFramePr/>
+                      <a:graphic>
+                        <a:graphicData uri="http://schemas.microsoft.com/office/word/2010/wordprocessingShape">
+                          <wps:wsp>
+                            <wps:cNvSpPr txBox="1"/>
+                            <wps:spPr>
+                              <a:xfrm>
+                                <a:off x="0" y="0"/>
+                                <a:ext cx="1270000" cy="381000"/>
+                              </a:xfrm>
+                              <a:prstGeom prst="rect">
+                                <a:avLst/>
+                              </a:prstGeom>
+                              <a:solidFill>
+                                <a:srgbClr val="0000FF"/>
+                              </a:solidFill>
+                            </wps:spPr>
+                            <wps:txbx>
+                              <w:txbxContent>
+                                <w:p>
+                                  <w:r>
+                                    <w:rPr>
+                                      <w:color w:val="FFFFFF"/>
+                                    </w:rPr>
+                                    <w:t>CENTERED</w:t>
+                                  </w:r>
+                                </w:p>
+                              </w:txbxContent>
+                            </wps:txbx>
+                            <wps:bodyPr/>
+                          </wps:wsp>
+                        </a:graphicData>
+                      </a:graphic>
+                    </wp:anchor>
+                  </w:drawing>
+                </mc:Choice>
+              </mc:AlternateContent>
+            </w:r>
+          </w:p>
+          <w:p>
+            <w:r>
+              <w:t>last</w:t>
+            </w:r>
+          </w:p>
+        </w:tc>
+      </w:tr>
+    </w:tbl>
+    <w:p/>
     <w:sectPr>
       <w:pgSz w:w="11906" w:h="16838"/>
       <w:pgMar w:top="1440" w:right="1800" w:bottom="1440" w:left="1800" w:header="851" w:footer="992"/>

</xml_diff>